<commit_message>
fix: security, performance and bug fixes from code review
</commit_message>
<xml_diff>
--- a/ATTORNEY_BUSINESS_SUMMARY.docx
+++ b/ATTORNEY_BUSINESS_SUMMARY.docx
@@ -182,6 +182,7 @@
     </w:p>
     <w:p>
       <w:r>
+        <w:lastRenderedPageBreak/>
         <w:t xml:space="preserve">- </w:t>
       </w:r>
       <w:r>
@@ -201,40 +202,6 @@
       </w:r>
       <w:r>
         <w:t xml:space="preserve"> (awaiting legal compliance)</w:t>
-      </w:r>
-    </w:p>
-    <w:p/>
-    <w:p>
-      <w:r>
-        <w:rPr>
-          <w:b/>
-        </w:rPr>
-        <w:t>Investment Required:</w:t>
-      </w:r>
-      <w:r>
-        <w:t xml:space="preserve"> $50,000-$100,000 (initial compliance &amp; launch)</w:t>
-      </w:r>
-    </w:p>
-    <w:p>
-      <w:r>
-        <w:rPr>
-          <w:b/>
-        </w:rPr>
-        <w:t>Timeline to Launch:</w:t>
-      </w:r>
-      <w:r>
-        <w:t xml:space="preserve"> 3-6 months (pending licenses)</w:t>
-      </w:r>
-    </w:p>
-    <w:p>
-      <w:r>
-        <w:rPr>
-          <w:b/>
-        </w:rPr>
-        <w:t>Target Market:</w:t>
-      </w:r>
-      <w:r>
-        <w:t xml:space="preserve"> 50M+ young adults (21-35) in US</w:t>
       </w:r>
     </w:p>
     <w:p/>
@@ -398,6 +365,7 @@
         <w:pStyle w:val="Heading3"/>
       </w:pPr>
       <w:r>
+        <w:lastRenderedPageBreak/>
         <w:t>Revenue Streams</w:t>
       </w:r>
     </w:p>
@@ -558,6 +526,7 @@
         <w:rPr>
           <w:b/>
         </w:rPr>
+        <w:lastRenderedPageBreak/>
         <w:t>Specific Concerns:</w:t>
       </w:r>
     </w:p>
@@ -687,6 +656,7 @@
     </w:p>
     <w:p>
       <w:r>
+        <w:lastRenderedPageBreak/>
         <w:t>- Do we need a separate escrow account?</w:t>
       </w:r>
     </w:p>
@@ -921,6 +891,7 @@
     </w:p>
     <w:p>
       <w:r>
+        <w:lastRenderedPageBreak/>
         <w:t>- We facilitate money transfers</w:t>
       </w:r>
     </w:p>
@@ -1044,6 +1015,7 @@
     </w:p>
     <w:p>
       <w:r>
+        <w:lastRenderedPageBreak/>
         <w:t>- Dispute resolution</w:t>
       </w:r>
     </w:p>
@@ -1163,6 +1135,7 @@
     </w:p>
     <w:p>
       <w:r>
+        <w:lastRenderedPageBreak/>
         <w:t>- Software tools: $200-$500</w:t>
       </w:r>
     </w:p>
@@ -1425,6 +1398,7 @@
         <w:pStyle w:val="Heading3"/>
       </w:pPr>
       <w:r>
+        <w:lastRenderedPageBreak/>
         <w:t>State Requirements</w:t>
       </w:r>
     </w:p>
@@ -1627,6 +1601,7 @@
     </w:p>
     <w:p>
       <w:r>
+        <w:lastRenderedPageBreak/>
         <w:t xml:space="preserve">- </w:t>
       </w:r>
       <w:r>
@@ -1818,6 +1793,7 @@
         <w:pStyle w:val="Heading2"/>
       </w:pPr>
       <w:r>
+        <w:lastRenderedPageBreak/>
         <w:t>TIMELINE TO LAUNCH</w:t>
       </w:r>
     </w:p>
@@ -1921,6 +1897,7 @@
     <w:p/>
     <w:p>
       <w:r>
+        <w:lastRenderedPageBreak/>
         <w:t xml:space="preserve">1. </w:t>
       </w:r>
       <w:r>
@@ -2087,6 +2064,7 @@
     <w:p/>
     <w:p>
       <w:r>
+        <w:lastRenderedPageBreak/>
         <w:t xml:space="preserve">1. </w:t>
       </w:r>
       <w:r>
@@ -2242,6 +2220,7 @@
     <w:p/>
     <w:p>
       <w:r>
+        <w:lastRenderedPageBreak/>
         <w:t>--------------------------------------------------</w:t>
       </w:r>
     </w:p>
@@ -2386,6 +2365,7 @@
     </w:p>
     <w:p>
       <w:r>
+        <w:lastRenderedPageBreak/>
         <w:t xml:space="preserve">   - Privacy Policy</w:t>
       </w:r>
     </w:p>
@@ -2522,6 +2502,7 @@
         <w:pStyle w:val="Heading2"/>
       </w:pPr>
       <w:r>
+        <w:lastRenderedPageBreak/>
         <w:t>CONFIDENTIALITY</w:t>
       </w:r>
     </w:p>

</xml_diff>